<commit_message>
Update STET input docs provided by PO
</commit_message>
<xml_diff>
--- a/backend/stet/data/stet_en.docx
+++ b/backend/stet/data/stet_en.docx
@@ -1,6 +1,6 @@
 
 <file path=word/document.xml><?xml version="1.0" encoding="utf-8"?>
-<w:document xmlns:wpc="http://schemas.microsoft.com/office/word/2010/wordprocessingCanvas" xmlns:mc="http://schemas.openxmlformats.org/markup-compatibility/2006" xmlns:o="urn:schemas-microsoft-com:office:office" xmlns:r="http://schemas.openxmlformats.org/officeDocument/2006/relationships" xmlns:m="http://schemas.openxmlformats.org/officeDocument/2006/math" xmlns:v="urn:schemas-microsoft-com:vml" xmlns:wp14="http://schemas.microsoft.com/office/word/2010/wordprocessingDrawing" xmlns:wp="http://schemas.openxmlformats.org/drawingml/2006/wordprocessingDrawing" xmlns:w10="urn:schemas-microsoft-com:office:word" xmlns:w="http://schemas.openxmlformats.org/wordprocessingml/2006/main" xmlns:w14="http://schemas.microsoft.com/office/word/2010/wordml" xmlns:w15="http://schemas.microsoft.com/office/word/2012/wordml" xmlns:wpg="http://schemas.microsoft.com/office/word/2010/wordprocessingGroup" xmlns:wpi="http://schemas.microsoft.com/office/word/2010/wordprocessingInk" xmlns:wne="http://schemas.microsoft.com/office/word/2006/wordml" xmlns:wps="http://schemas.microsoft.com/office/word/2010/wordprocessingShape" mc:Ignorable="w14 w15 wp14">
+<w:document xmlns:wpc="http://schemas.microsoft.com/office/word/2010/wordprocessingCanvas" xmlns:cx="http://schemas.microsoft.com/office/drawing/2014/chartex" xmlns:cx1="http://schemas.microsoft.com/office/drawing/2015/9/8/chartex" xmlns:cx2="http://schemas.microsoft.com/office/drawing/2015/10/21/chartex" xmlns:cx3="http://schemas.microsoft.com/office/drawing/2016/5/9/chartex" xmlns:cx4="http://schemas.microsoft.com/office/drawing/2016/5/10/chartex" xmlns:cx5="http://schemas.microsoft.com/office/drawing/2016/5/11/chartex" xmlns:cx6="http://schemas.microsoft.com/office/drawing/2016/5/12/chartex" xmlns:cx7="http://schemas.microsoft.com/office/drawing/2016/5/13/chartex" xmlns:cx8="http://schemas.microsoft.com/office/drawing/2016/5/14/chartex" xmlns:mc="http://schemas.openxmlformats.org/markup-compatibility/2006" xmlns:aink="http://schemas.microsoft.com/office/drawing/2016/ink" xmlns:am3d="http://schemas.microsoft.com/office/drawing/2017/model3d" xmlns:o="urn:schemas-microsoft-com:office:office" xmlns:oel="http://schemas.microsoft.com/office/2019/extlst" xmlns:r="http://schemas.openxmlformats.org/officeDocument/2006/relationships" xmlns:m="http://schemas.openxmlformats.org/officeDocument/2006/math" xmlns:v="urn:schemas-microsoft-com:vml" xmlns:wp14="http://schemas.microsoft.com/office/word/2010/wordprocessingDrawing" xmlns:wp="http://schemas.openxmlformats.org/drawingml/2006/wordprocessingDrawing" xmlns:w10="urn:schemas-microsoft-com:office:word" xmlns:w="http://schemas.openxmlformats.org/wordprocessingml/2006/main" xmlns:w14="http://schemas.microsoft.com/office/word/2010/wordml" xmlns:w15="http://schemas.microsoft.com/office/word/2012/wordml" xmlns:w16cex="http://schemas.microsoft.com/office/word/2018/wordml/cex" xmlns:w16cid="http://schemas.microsoft.com/office/word/2016/wordml/cid" xmlns:w16="http://schemas.microsoft.com/office/word/2018/wordml" xmlns:w16du="http://schemas.microsoft.com/office/word/2023/wordml/word16du" xmlns:w16sdtdh="http://schemas.microsoft.com/office/word/2020/wordml/sdtdatahash" xmlns:w16sdtfl="http://schemas.microsoft.com/office/word/2024/wordml/sdtformatlock" xmlns:w16se="http://schemas.microsoft.com/office/word/2015/wordml/symex" xmlns:wpg="http://schemas.microsoft.com/office/word/2010/wordprocessingGroup" xmlns:wpi="http://schemas.microsoft.com/office/word/2010/wordprocessingInk" xmlns:wne="http://schemas.microsoft.com/office/word/2006/wordml" xmlns:wps="http://schemas.microsoft.com/office/word/2010/wordprocessingShape" mc:Ignorable="w14 w15 w16se w16cid w16 w16cex w16sdtdh w16sdtfl w16du wp14">
   <w:body>
     <w:tbl>
       <w:tblPr>
@@ -9,10 +9,10 @@
         <w:tblLook w:val="04A0" w:firstRow="1" w:lastRow="0" w:firstColumn="1" w:lastColumn="0" w:noHBand="0" w:noVBand="1"/>
       </w:tblPr>
       <w:tblGrid>
-        <w:gridCol w:w="1857"/>
-        <w:gridCol w:w="5489"/>
-        <w:gridCol w:w="3539"/>
-        <w:gridCol w:w="3505"/>
+        <w:gridCol w:w="1808"/>
+        <w:gridCol w:w="5512"/>
+        <w:gridCol w:w="3553"/>
+        <w:gridCol w:w="3517"/>
       </w:tblGrid>
       <w:tr>
         <w:trPr>
@@ -511,6 +511,7 @@
                 <w:b/>
                 <w:bCs/>
               </w:rPr>
+              <w:lastRenderedPageBreak/>
               <w:t>anger</w:t>
             </w:r>
           </w:p>
@@ -646,7 +647,6 @@
                 <w:b/>
                 <w:bCs/>
               </w:rPr>
-              <w:lastRenderedPageBreak/>
               <w:t>apostle</w:t>
             </w:r>
           </w:p>
@@ -802,6 +802,7 @@
                 <w:b/>
                 <w:bCs/>
               </w:rPr>
+              <w:lastRenderedPageBreak/>
               <w:t>ashamed</w:t>
             </w:r>
           </w:p>
@@ -992,7 +993,6 @@
                 <w:b/>
                 <w:bCs/>
               </w:rPr>
-              <w:lastRenderedPageBreak/>
               <w:t>authority</w:t>
             </w:r>
           </w:p>
@@ -1174,6 +1174,7 @@
                 <w:b/>
                 <w:bCs/>
               </w:rPr>
+              <w:lastRenderedPageBreak/>
               <w:t>baptize</w:t>
             </w:r>
           </w:p>
@@ -1372,7 +1373,6 @@
                 <w:b/>
                 <w:bCs/>
               </w:rPr>
-              <w:lastRenderedPageBreak/>
               <w:t>believe</w:t>
             </w:r>
           </w:p>
@@ -1547,6 +1547,7 @@
                 <w:b/>
                 <w:bCs/>
               </w:rPr>
+              <w:lastRenderedPageBreak/>
               <w:t>beloved</w:t>
             </w:r>
           </w:p>
@@ -1700,7 +1701,6 @@
                 <w:b/>
                 <w:bCs/>
               </w:rPr>
-              <w:lastRenderedPageBreak/>
               <w:t>blameless</w:t>
             </w:r>
           </w:p>
@@ -1880,6 +1880,7 @@
                 <w:b/>
                 <w:bCs/>
               </w:rPr>
+              <w:lastRenderedPageBreak/>
               <w:t>blaspheme</w:t>
             </w:r>
           </w:p>
@@ -4440,7 +4441,23 @@
                 <w:rFonts w:asciiTheme="minorHAnsi" w:hAnsiTheme="minorHAnsi" w:cs="Noto Sans"/>
                 <w:color w:val="000000"/>
               </w:rPr>
-              <w:t xml:space="preserve"> god, divine power, or deity</w:t>
+              <w:t xml:space="preserve"> </w:t>
+            </w:r>
+            <w:proofErr w:type="gramStart"/>
+            <w:r>
+              <w:rPr>
+                <w:rFonts w:asciiTheme="minorHAnsi" w:hAnsiTheme="minorHAnsi" w:cs="Noto Sans"/>
+                <w:color w:val="000000"/>
+              </w:rPr>
+              <w:t>god</w:t>
+            </w:r>
+            <w:proofErr w:type="gramEnd"/>
+            <w:r>
+              <w:rPr>
+                <w:rFonts w:asciiTheme="minorHAnsi" w:hAnsiTheme="minorHAnsi" w:cs="Noto Sans"/>
+                <w:color w:val="000000"/>
+              </w:rPr>
+              <w:t>, divine power, or deity</w:t>
             </w:r>
             <w:r>
               <w:rPr>
@@ -6933,18 +6950,28 @@
           </w:p>
           <w:p>
             <w:r>
-              <w:t>Galatians 2:16, 20</w:t>
+              <w:t>Galatians 2:16</w:t>
+            </w:r>
+          </w:p>
+          <w:p>
+            <w:r>
+              <w:t>Galatians 2:</w:t>
+            </w:r>
+            <w:r>
+              <w:t>20</w:t>
             </w:r>
           </w:p>
           <w:p>
             <w:r>
               <w:t>Galatians 5:19</w:t>
             </w:r>
-            <w:r>
-              <w:t>,</w:t>
-            </w:r>
-            <w:r>
-              <w:t xml:space="preserve"> 24</w:t>
+          </w:p>
+          <w:p>
+            <w:r>
+              <w:t>Galatians 5:</w:t>
+            </w:r>
+            <w:r>
+              <w:t>24</w:t>
             </w:r>
           </w:p>
           <w:p>
@@ -6996,14 +7023,23 @@
                 <w:bCs/>
               </w:rPr>
             </w:pPr>
+            <w:proofErr w:type="spellStart"/>
             <w:r>
               <w:rPr>
                 <w:b/>
                 <w:bCs/>
               </w:rPr>
               <w:lastRenderedPageBreak/>
-              <w:t>foreknow</w:t>
-            </w:r>
+              <w:t>f</w:t>
+            </w:r>
+            <w:r>
+              <w:rPr>
+                <w:b/>
+                <w:bCs/>
+              </w:rPr>
+              <w:t>know</w:t>
+            </w:r>
+            <w:proofErr w:type="spellEnd"/>
           </w:p>
           <w:p>
             <w:r>
@@ -7361,6 +7397,7 @@
                 <w:b/>
                 <w:bCs/>
               </w:rPr>
+              <w:lastRenderedPageBreak/>
               <w:t>fulfill</w:t>
             </w:r>
           </w:p>
@@ -7565,7 +7602,6 @@
                 <w:b/>
                 <w:bCs/>
               </w:rPr>
-              <w:lastRenderedPageBreak/>
               <w:t>g</w:t>
             </w:r>
             <w:r>
@@ -7740,6 +7776,7 @@
                 <w:b/>
                 <w:bCs/>
               </w:rPr>
+              <w:lastRenderedPageBreak/>
               <w:t>godly</w:t>
             </w:r>
             <w:r>
@@ -7952,7 +7989,6 @@
                 <w:b/>
                 <w:bCs/>
               </w:rPr>
-              <w:lastRenderedPageBreak/>
               <w:t>good</w:t>
             </w:r>
           </w:p>
@@ -8186,6 +8222,7 @@
                 <w:b/>
                 <w:bCs/>
               </w:rPr>
+              <w:lastRenderedPageBreak/>
               <w:t xml:space="preserve">Good News </w:t>
             </w:r>
           </w:p>
@@ -8322,7 +8359,6 @@
                 <w:b/>
                 <w:bCs/>
               </w:rPr>
-              <w:lastRenderedPageBreak/>
               <w:t>grace</w:t>
             </w:r>
           </w:p>
@@ -8499,14 +8535,19 @@
               </w:rPr>
               <w:t xml:space="preserve">grace, </w:t>
             </w:r>
-            <w:bookmarkStart w:id="0" w:name="_GoBack"/>
-            <w:bookmarkEnd w:id="0"/>
-            <w:r>
-              <w:rPr>
-                <w:b/>
-                <w:bCs/>
+            <w:r>
+              <w:rPr>
+                <w:b/>
+                <w:bCs/>
+                <w:highlight w:val="yellow"/>
               </w:rPr>
               <w:t>favor</w:t>
+            </w:r>
+            <w:r>
+              <w:rPr>
+                <w:highlight w:val="yellow"/>
+              </w:rPr>
+              <w:t>:</w:t>
             </w:r>
           </w:p>
         </w:tc>
@@ -8532,6 +8573,7 @@
                 <w:b/>
                 <w:bCs/>
               </w:rPr>
+              <w:lastRenderedPageBreak/>
               <w:t>heart</w:t>
             </w:r>
           </w:p>
@@ -8734,7 +8776,6 @@
                 <w:b/>
                 <w:bCs/>
               </w:rPr>
-              <w:lastRenderedPageBreak/>
               <w:t>heaven</w:t>
             </w:r>
           </w:p>
@@ -8814,7 +8855,15 @@
           </w:tcPr>
           <w:p>
             <w:r>
-              <w:t>Matthew 3:16, 17</w:t>
+              <w:t xml:space="preserve">Matthew 3:16 </w:t>
+            </w:r>
+          </w:p>
+          <w:p>
+            <w:r>
+              <w:t>Matthew 3:</w:t>
+            </w:r>
+            <w:r>
+              <w:t>17</w:t>
             </w:r>
           </w:p>
           <w:p>
@@ -8919,6 +8968,7 @@
                 <w:b/>
                 <w:bCs/>
               </w:rPr>
+              <w:lastRenderedPageBreak/>
               <w:t>heir</w:t>
             </w:r>
           </w:p>
@@ -9175,7 +9225,6 @@
                 <w:b/>
                 <w:bCs/>
               </w:rPr>
-              <w:lastRenderedPageBreak/>
               <w:t>hell</w:t>
             </w:r>
           </w:p>
@@ -9343,6 +9392,7 @@
                 <w:b/>
                 <w:bCs/>
               </w:rPr>
+              <w:lastRenderedPageBreak/>
               <w:t>holy</w:t>
             </w:r>
           </w:p>
@@ -9565,7 +9615,6 @@
                 <w:b/>
                 <w:bCs/>
               </w:rPr>
-              <w:lastRenderedPageBreak/>
               <w:t>Holy Spirit</w:t>
             </w:r>
           </w:p>
@@ -9696,6 +9745,7 @@
                 <w:b/>
                 <w:bCs/>
               </w:rPr>
+              <w:lastRenderedPageBreak/>
               <w:t>honor</w:t>
             </w:r>
           </w:p>
@@ -9917,7 +9967,6 @@
                 <w:b/>
                 <w:bCs/>
               </w:rPr>
-              <w:lastRenderedPageBreak/>
               <w:t>hope</w:t>
             </w:r>
           </w:p>
@@ -10139,6 +10188,7 @@
                 <w:b/>
                 <w:bCs/>
               </w:rPr>
+              <w:lastRenderedPageBreak/>
               <w:t>inheritance</w:t>
             </w:r>
           </w:p>
@@ -10319,7 +10369,6 @@
                 <w:b/>
                 <w:bCs/>
               </w:rPr>
-              <w:lastRenderedPageBreak/>
               <w:t>Jesus Christ</w:t>
             </w:r>
           </w:p>
@@ -10453,6 +10502,7 @@
                 <w:b/>
                 <w:bCs/>
               </w:rPr>
+              <w:lastRenderedPageBreak/>
               <w:t>joy</w:t>
             </w:r>
           </w:p>
@@ -10649,7 +10699,6 @@
                 <w:b/>
                 <w:bCs/>
               </w:rPr>
-              <w:lastRenderedPageBreak/>
               <w:t>judge</w:t>
             </w:r>
           </w:p>
@@ -10899,6 +10948,7 @@
                 <w:b/>
                 <w:bCs/>
               </w:rPr>
+              <w:lastRenderedPageBreak/>
               <w:t>justify</w:t>
             </w:r>
           </w:p>
@@ -11086,7 +11136,6 @@
                 <w:b/>
                 <w:bCs/>
               </w:rPr>
-              <w:lastRenderedPageBreak/>
               <w:t xml:space="preserve">kingdom </w:t>
             </w:r>
           </w:p>
@@ -11456,6 +11505,7 @@
                 <w:b/>
                 <w:bCs/>
               </w:rPr>
+              <w:lastRenderedPageBreak/>
               <w:t>law</w:t>
             </w:r>
           </w:p>
@@ -11681,7 +11731,6 @@
                 <w:b/>
                 <w:bCs/>
               </w:rPr>
-              <w:lastRenderedPageBreak/>
               <w:t>life</w:t>
             </w:r>
           </w:p>
@@ -11848,6 +11897,7 @@
                 <w:b/>
                 <w:bCs/>
               </w:rPr>
+              <w:lastRenderedPageBreak/>
               <w:t>lion</w:t>
             </w:r>
           </w:p>
@@ -12001,7 +12051,6 @@
                 <w:b/>
                 <w:bCs/>
               </w:rPr>
-              <w:lastRenderedPageBreak/>
               <w:t>Lord</w:t>
             </w:r>
           </w:p>
@@ -12141,6 +12190,7 @@
                 <w:b/>
                 <w:bCs/>
               </w:rPr>
+              <w:lastRenderedPageBreak/>
               <w:t xml:space="preserve">love </w:t>
             </w:r>
           </w:p>
@@ -14614,6 +14664,7 @@
                 <w:b/>
                 <w:bCs/>
               </w:rPr>
+              <w:lastRenderedPageBreak/>
               <w:t>redemption</w:t>
             </w:r>
           </w:p>
@@ -14773,7 +14824,6 @@
                 <w:b/>
                 <w:bCs/>
               </w:rPr>
-              <w:lastRenderedPageBreak/>
               <w:t>repent</w:t>
             </w:r>
           </w:p>
@@ -14982,6 +15032,7 @@
                 <w:b/>
                 <w:bCs/>
               </w:rPr>
+              <w:lastRenderedPageBreak/>
               <w:t xml:space="preserve">resurrection </w:t>
             </w:r>
           </w:p>
@@ -15212,7 +15263,6 @@
                 <w:b/>
                 <w:bCs/>
               </w:rPr>
-              <w:lastRenderedPageBreak/>
               <w:t xml:space="preserve">righteous </w:t>
             </w:r>
           </w:p>
@@ -15438,6 +15488,7 @@
                 <w:b/>
                 <w:bCs/>
               </w:rPr>
+              <w:lastRenderedPageBreak/>
               <w:t xml:space="preserve">sacrifice </w:t>
             </w:r>
           </w:p>
@@ -15656,7 +15707,6 @@
                 <w:b/>
                 <w:bCs/>
               </w:rPr>
-              <w:lastRenderedPageBreak/>
               <w:t xml:space="preserve">salvation </w:t>
             </w:r>
           </w:p>
@@ -15894,6 +15944,7 @@
                 <w:b/>
                 <w:bCs/>
               </w:rPr>
+              <w:lastRenderedPageBreak/>
               <w:t>s</w:t>
             </w:r>
             <w:r>
@@ -16112,7 +16163,6 @@
                 <w:b/>
                 <w:bCs/>
               </w:rPr>
-              <w:lastRenderedPageBreak/>
               <w:t>save</w:t>
             </w:r>
           </w:p>
@@ -16325,6 +16375,7 @@
                 <w:b/>
                 <w:bCs/>
               </w:rPr>
+              <w:lastRenderedPageBreak/>
               <w:t xml:space="preserve">scriptures </w:t>
             </w:r>
           </w:p>
@@ -16542,7 +16593,6 @@
                 <w:b/>
                 <w:bCs/>
               </w:rPr>
-              <w:lastRenderedPageBreak/>
               <w:t>shame</w:t>
             </w:r>
           </w:p>
@@ -16701,6 +16751,7 @@
                 <w:b/>
                 <w:bCs/>
               </w:rPr>
+              <w:lastRenderedPageBreak/>
               <w:t xml:space="preserve">sheep </w:t>
             </w:r>
           </w:p>
@@ -20172,7 +20223,7 @@
 </file>
 
 <file path=word/numbering.xml><?xml version="1.0" encoding="utf-8"?>
-<w:numbering xmlns:wpc="http://schemas.microsoft.com/office/word/2010/wordprocessingCanvas" xmlns:mc="http://schemas.openxmlformats.org/markup-compatibility/2006" xmlns:o="urn:schemas-microsoft-com:office:office" xmlns:r="http://schemas.openxmlformats.org/officeDocument/2006/relationships" xmlns:m="http://schemas.openxmlformats.org/officeDocument/2006/math" xmlns:v="urn:schemas-microsoft-com:vml" xmlns:wp14="http://schemas.microsoft.com/office/word/2010/wordprocessingDrawing" xmlns:wp="http://schemas.openxmlformats.org/drawingml/2006/wordprocessingDrawing" xmlns:w10="urn:schemas-microsoft-com:office:word" xmlns:w="http://schemas.openxmlformats.org/wordprocessingml/2006/main" xmlns:w14="http://schemas.microsoft.com/office/word/2010/wordml" xmlns:w15="http://schemas.microsoft.com/office/word/2012/wordml" xmlns:wpg="http://schemas.microsoft.com/office/word/2010/wordprocessingGroup" xmlns:wpi="http://schemas.microsoft.com/office/word/2010/wordprocessingInk" xmlns:wne="http://schemas.microsoft.com/office/word/2006/wordml" xmlns:wps="http://schemas.microsoft.com/office/word/2010/wordprocessingShape" mc:Ignorable="w14 w15 wp14">
+<w:numbering xmlns:wpc="http://schemas.microsoft.com/office/word/2010/wordprocessingCanvas" xmlns:cx="http://schemas.microsoft.com/office/drawing/2014/chartex" xmlns:cx1="http://schemas.microsoft.com/office/drawing/2015/9/8/chartex" xmlns:cx2="http://schemas.microsoft.com/office/drawing/2015/10/21/chartex" xmlns:cx3="http://schemas.microsoft.com/office/drawing/2016/5/9/chartex" xmlns:cx4="http://schemas.microsoft.com/office/drawing/2016/5/10/chartex" xmlns:cx5="http://schemas.microsoft.com/office/drawing/2016/5/11/chartex" xmlns:cx6="http://schemas.microsoft.com/office/drawing/2016/5/12/chartex" xmlns:cx7="http://schemas.microsoft.com/office/drawing/2016/5/13/chartex" xmlns:cx8="http://schemas.microsoft.com/office/drawing/2016/5/14/chartex" xmlns:mc="http://schemas.openxmlformats.org/markup-compatibility/2006" xmlns:aink="http://schemas.microsoft.com/office/drawing/2016/ink" xmlns:am3d="http://schemas.microsoft.com/office/drawing/2017/model3d" xmlns:o="urn:schemas-microsoft-com:office:office" xmlns:oel="http://schemas.microsoft.com/office/2019/extlst" xmlns:r="http://schemas.openxmlformats.org/officeDocument/2006/relationships" xmlns:m="http://schemas.openxmlformats.org/officeDocument/2006/math" xmlns:v="urn:schemas-microsoft-com:vml" xmlns:wp14="http://schemas.microsoft.com/office/word/2010/wordprocessingDrawing" xmlns:wp="http://schemas.openxmlformats.org/drawingml/2006/wordprocessingDrawing" xmlns:w10="urn:schemas-microsoft-com:office:word" xmlns:w="http://schemas.openxmlformats.org/wordprocessingml/2006/main" xmlns:w14="http://schemas.microsoft.com/office/word/2010/wordml" xmlns:w15="http://schemas.microsoft.com/office/word/2012/wordml" xmlns:w16cex="http://schemas.microsoft.com/office/word/2018/wordml/cex" xmlns:w16cid="http://schemas.microsoft.com/office/word/2016/wordml/cid" xmlns:w16="http://schemas.microsoft.com/office/word/2018/wordml" xmlns:w16du="http://schemas.microsoft.com/office/word/2023/wordml/word16du" xmlns:w16sdtdh="http://schemas.microsoft.com/office/word/2020/wordml/sdtdatahash" xmlns:w16sdtfl="http://schemas.microsoft.com/office/word/2024/wordml/sdtformatlock" xmlns:w16se="http://schemas.microsoft.com/office/word/2015/wordml/symex" xmlns:wpg="http://schemas.microsoft.com/office/word/2010/wordprocessingGroup" xmlns:wpi="http://schemas.microsoft.com/office/word/2010/wordprocessingInk" xmlns:wne="http://schemas.microsoft.com/office/word/2006/wordml" xmlns:wps="http://schemas.microsoft.com/office/word/2010/wordprocessingShape" mc:Ignorable="w14 w15 w16se w16cid w16 w16cex w16sdtdh w16sdtfl w16du wp14">
   <w:abstractNum w:abstractNumId="0" w15:restartNumberingAfterBreak="0">
     <w:nsid w:val="0000A991"/>
     <w:multiLevelType w:val="multilevel"/>
@@ -29698,256 +29749,256 @@
       </w:rPr>
     </w:lvl>
   </w:abstractNum>
-  <w:num w:numId="1">
+  <w:num w:numId="1" w16cid:durableId="193733981">
     <w:abstractNumId w:val="8"/>
   </w:num>
-  <w:num w:numId="2">
+  <w:num w:numId="2" w16cid:durableId="760030379">
     <w:abstractNumId w:val="83"/>
   </w:num>
-  <w:num w:numId="3">
+  <w:num w:numId="3" w16cid:durableId="527137262">
     <w:abstractNumId w:val="82"/>
   </w:num>
-  <w:num w:numId="4">
+  <w:num w:numId="4" w16cid:durableId="425269955">
     <w:abstractNumId w:val="55"/>
   </w:num>
-  <w:num w:numId="5">
+  <w:num w:numId="5" w16cid:durableId="1056247886">
     <w:abstractNumId w:val="26"/>
   </w:num>
-  <w:num w:numId="6">
+  <w:num w:numId="6" w16cid:durableId="1470243334">
     <w:abstractNumId w:val="66"/>
   </w:num>
-  <w:num w:numId="7">
+  <w:num w:numId="7" w16cid:durableId="1869676824">
     <w:abstractNumId w:val="30"/>
   </w:num>
-  <w:num w:numId="8">
+  <w:num w:numId="8" w16cid:durableId="1679767248">
     <w:abstractNumId w:val="4"/>
   </w:num>
-  <w:num w:numId="9">
+  <w:num w:numId="9" w16cid:durableId="1274627801">
     <w:abstractNumId w:val="20"/>
   </w:num>
-  <w:num w:numId="10">
+  <w:num w:numId="10" w16cid:durableId="717171090">
     <w:abstractNumId w:val="80"/>
   </w:num>
-  <w:num w:numId="11">
+  <w:num w:numId="11" w16cid:durableId="1394428091">
     <w:abstractNumId w:val="71"/>
   </w:num>
-  <w:num w:numId="12">
+  <w:num w:numId="12" w16cid:durableId="1028337723">
     <w:abstractNumId w:val="69"/>
   </w:num>
-  <w:num w:numId="13">
+  <w:num w:numId="13" w16cid:durableId="1152411401">
     <w:abstractNumId w:val="27"/>
   </w:num>
-  <w:num w:numId="14">
+  <w:num w:numId="14" w16cid:durableId="662703860">
     <w:abstractNumId w:val="39"/>
   </w:num>
-  <w:num w:numId="15">
+  <w:num w:numId="15" w16cid:durableId="928805173">
     <w:abstractNumId w:val="37"/>
   </w:num>
-  <w:num w:numId="16">
+  <w:num w:numId="16" w16cid:durableId="1709529939">
     <w:abstractNumId w:val="41"/>
   </w:num>
-  <w:num w:numId="17">
+  <w:num w:numId="17" w16cid:durableId="1150367587">
     <w:abstractNumId w:val="1"/>
   </w:num>
-  <w:num w:numId="18">
+  <w:num w:numId="18" w16cid:durableId="543833968">
     <w:abstractNumId w:val="73"/>
   </w:num>
-  <w:num w:numId="19">
+  <w:num w:numId="19" w16cid:durableId="756486473">
     <w:abstractNumId w:val="49"/>
   </w:num>
-  <w:num w:numId="20">
+  <w:num w:numId="20" w16cid:durableId="1275362702">
     <w:abstractNumId w:val="3"/>
   </w:num>
-  <w:num w:numId="21">
+  <w:num w:numId="21" w16cid:durableId="545458975">
     <w:abstractNumId w:val="47"/>
   </w:num>
-  <w:num w:numId="22">
+  <w:num w:numId="22" w16cid:durableId="1589075198">
     <w:abstractNumId w:val="40"/>
   </w:num>
-  <w:num w:numId="23">
+  <w:num w:numId="23" w16cid:durableId="392431635">
     <w:abstractNumId w:val="53"/>
   </w:num>
-  <w:num w:numId="24">
+  <w:num w:numId="24" w16cid:durableId="428933504">
     <w:abstractNumId w:val="34"/>
   </w:num>
-  <w:num w:numId="25">
+  <w:num w:numId="25" w16cid:durableId="733357364">
     <w:abstractNumId w:val="2"/>
   </w:num>
-  <w:num w:numId="26">
+  <w:num w:numId="26" w16cid:durableId="266743309">
     <w:abstractNumId w:val="70"/>
   </w:num>
-  <w:num w:numId="27">
+  <w:num w:numId="27" w16cid:durableId="630402698">
     <w:abstractNumId w:val="15"/>
   </w:num>
-  <w:num w:numId="28">
+  <w:num w:numId="28" w16cid:durableId="384452694">
     <w:abstractNumId w:val="42"/>
   </w:num>
-  <w:num w:numId="29">
+  <w:num w:numId="29" w16cid:durableId="840973392">
     <w:abstractNumId w:val="13"/>
   </w:num>
-  <w:num w:numId="30">
+  <w:num w:numId="30" w16cid:durableId="1205867415">
     <w:abstractNumId w:val="31"/>
   </w:num>
-  <w:num w:numId="31">
+  <w:num w:numId="31" w16cid:durableId="381904598">
     <w:abstractNumId w:val="72"/>
   </w:num>
-  <w:num w:numId="32">
+  <w:num w:numId="32" w16cid:durableId="555438986">
     <w:abstractNumId w:val="25"/>
   </w:num>
-  <w:num w:numId="33">
+  <w:num w:numId="33" w16cid:durableId="652756369">
     <w:abstractNumId w:val="10"/>
   </w:num>
-  <w:num w:numId="34">
+  <w:num w:numId="34" w16cid:durableId="287206062">
     <w:abstractNumId w:val="48"/>
   </w:num>
-  <w:num w:numId="35">
+  <w:num w:numId="35" w16cid:durableId="876743842">
     <w:abstractNumId w:val="50"/>
   </w:num>
-  <w:num w:numId="36">
+  <w:num w:numId="36" w16cid:durableId="1617787493">
     <w:abstractNumId w:val="32"/>
   </w:num>
-  <w:num w:numId="37">
+  <w:num w:numId="37" w16cid:durableId="69692028">
     <w:abstractNumId w:val="63"/>
   </w:num>
-  <w:num w:numId="38">
+  <w:num w:numId="38" w16cid:durableId="1185827661">
     <w:abstractNumId w:val="14"/>
   </w:num>
-  <w:num w:numId="39">
+  <w:num w:numId="39" w16cid:durableId="635961693">
     <w:abstractNumId w:val="60"/>
   </w:num>
-  <w:num w:numId="40">
+  <w:num w:numId="40" w16cid:durableId="616986513">
     <w:abstractNumId w:val="35"/>
   </w:num>
-  <w:num w:numId="41">
+  <w:num w:numId="41" w16cid:durableId="2025356426">
     <w:abstractNumId w:val="11"/>
   </w:num>
-  <w:num w:numId="42">
+  <w:num w:numId="42" w16cid:durableId="321353503">
     <w:abstractNumId w:val="33"/>
   </w:num>
-  <w:num w:numId="43">
+  <w:num w:numId="43" w16cid:durableId="1483160115">
     <w:abstractNumId w:val="76"/>
   </w:num>
-  <w:num w:numId="44">
+  <w:num w:numId="44" w16cid:durableId="262609934">
     <w:abstractNumId w:val="56"/>
   </w:num>
-  <w:num w:numId="45">
+  <w:num w:numId="45" w16cid:durableId="506793433">
     <w:abstractNumId w:val="68"/>
   </w:num>
-  <w:num w:numId="46">
+  <w:num w:numId="46" w16cid:durableId="1657997144">
     <w:abstractNumId w:val="81"/>
   </w:num>
-  <w:num w:numId="47">
+  <w:num w:numId="47" w16cid:durableId="896474799">
     <w:abstractNumId w:val="52"/>
   </w:num>
-  <w:num w:numId="48">
+  <w:num w:numId="48" w16cid:durableId="1942183771">
     <w:abstractNumId w:val="65"/>
   </w:num>
-  <w:num w:numId="49">
+  <w:num w:numId="49" w16cid:durableId="467937617">
     <w:abstractNumId w:val="44"/>
   </w:num>
-  <w:num w:numId="50">
+  <w:num w:numId="50" w16cid:durableId="2027781289">
     <w:abstractNumId w:val="22"/>
   </w:num>
-  <w:num w:numId="51">
+  <w:num w:numId="51" w16cid:durableId="1400859783">
     <w:abstractNumId w:val="29"/>
   </w:num>
-  <w:num w:numId="52">
+  <w:num w:numId="52" w16cid:durableId="2136675572">
     <w:abstractNumId w:val="74"/>
   </w:num>
-  <w:num w:numId="53">
+  <w:num w:numId="53" w16cid:durableId="1894732053">
     <w:abstractNumId w:val="45"/>
   </w:num>
-  <w:num w:numId="54">
+  <w:num w:numId="54" w16cid:durableId="520751718">
     <w:abstractNumId w:val="9"/>
   </w:num>
-  <w:num w:numId="55">
+  <w:num w:numId="55" w16cid:durableId="129371697">
     <w:abstractNumId w:val="23"/>
   </w:num>
-  <w:num w:numId="56">
+  <w:num w:numId="56" w16cid:durableId="1364014439">
     <w:abstractNumId w:val="59"/>
   </w:num>
-  <w:num w:numId="57">
+  <w:num w:numId="57" w16cid:durableId="771709124">
     <w:abstractNumId w:val="17"/>
   </w:num>
-  <w:num w:numId="58">
+  <w:num w:numId="58" w16cid:durableId="2144036288">
     <w:abstractNumId w:val="43"/>
   </w:num>
-  <w:num w:numId="59">
+  <w:num w:numId="59" w16cid:durableId="1148939237">
     <w:abstractNumId w:val="64"/>
   </w:num>
-  <w:num w:numId="60">
+  <w:num w:numId="60" w16cid:durableId="1560821708">
     <w:abstractNumId w:val="19"/>
   </w:num>
-  <w:num w:numId="61">
+  <w:num w:numId="61" w16cid:durableId="1579944128">
     <w:abstractNumId w:val="54"/>
   </w:num>
-  <w:num w:numId="62">
+  <w:num w:numId="62" w16cid:durableId="1788967850">
     <w:abstractNumId w:val="79"/>
   </w:num>
-  <w:num w:numId="63">
+  <w:num w:numId="63" w16cid:durableId="1751467098">
     <w:abstractNumId w:val="78"/>
   </w:num>
-  <w:num w:numId="64">
+  <w:num w:numId="64" w16cid:durableId="1762290188">
     <w:abstractNumId w:val="24"/>
   </w:num>
-  <w:num w:numId="65">
+  <w:num w:numId="65" w16cid:durableId="1675720596">
     <w:abstractNumId w:val="28"/>
   </w:num>
-  <w:num w:numId="66">
+  <w:num w:numId="66" w16cid:durableId="494029160">
     <w:abstractNumId w:val="61"/>
   </w:num>
-  <w:num w:numId="67">
+  <w:num w:numId="67" w16cid:durableId="1613508675">
     <w:abstractNumId w:val="38"/>
   </w:num>
-  <w:num w:numId="68">
+  <w:num w:numId="68" w16cid:durableId="1701083051">
     <w:abstractNumId w:val="16"/>
   </w:num>
-  <w:num w:numId="69">
+  <w:num w:numId="69" w16cid:durableId="627979772">
     <w:abstractNumId w:val="36"/>
   </w:num>
-  <w:num w:numId="70">
+  <w:num w:numId="70" w16cid:durableId="1471744833">
     <w:abstractNumId w:val="67"/>
   </w:num>
-  <w:num w:numId="71">
+  <w:num w:numId="71" w16cid:durableId="1815219610">
     <w:abstractNumId w:val="58"/>
   </w:num>
-  <w:num w:numId="72">
+  <w:num w:numId="72" w16cid:durableId="1022363581">
     <w:abstractNumId w:val="12"/>
   </w:num>
-  <w:num w:numId="73">
+  <w:num w:numId="73" w16cid:durableId="1395355708">
     <w:abstractNumId w:val="57"/>
   </w:num>
-  <w:num w:numId="74">
+  <w:num w:numId="74" w16cid:durableId="1727295882">
     <w:abstractNumId w:val="6"/>
   </w:num>
-  <w:num w:numId="75">
+  <w:num w:numId="75" w16cid:durableId="1544710060">
     <w:abstractNumId w:val="5"/>
   </w:num>
-  <w:num w:numId="76">
+  <w:num w:numId="76" w16cid:durableId="1517110351">
     <w:abstractNumId w:val="46"/>
   </w:num>
-  <w:num w:numId="77">
+  <w:num w:numId="77" w16cid:durableId="830024579">
     <w:abstractNumId w:val="62"/>
   </w:num>
-  <w:num w:numId="78">
+  <w:num w:numId="78" w16cid:durableId="1301959989">
     <w:abstractNumId w:val="18"/>
   </w:num>
-  <w:num w:numId="79">
+  <w:num w:numId="79" w16cid:durableId="527722823">
     <w:abstractNumId w:val="0"/>
   </w:num>
-  <w:num w:numId="80">
+  <w:num w:numId="80" w16cid:durableId="1649673462">
     <w:abstractNumId w:val="77"/>
   </w:num>
-  <w:num w:numId="81">
+  <w:num w:numId="81" w16cid:durableId="827869873">
     <w:abstractNumId w:val="21"/>
   </w:num>
-  <w:num w:numId="82">
+  <w:num w:numId="82" w16cid:durableId="2070227426">
     <w:abstractNumId w:val="75"/>
   </w:num>
-  <w:num w:numId="83">
+  <w:num w:numId="83" w16cid:durableId="630475349">
     <w:abstractNumId w:val="51"/>
   </w:num>
-  <w:num w:numId="84">
+  <w:num w:numId="84" w16cid:durableId="1209075268">
     <w:abstractNumId w:val="7"/>
   </w:num>
   <w:numIdMacAtCleanup w:val="78"/>
@@ -29955,7 +30006,7 @@
 </file>
 
 <file path=word/styles.xml><?xml version="1.0" encoding="utf-8"?>
-<w:styles xmlns:mc="http://schemas.openxmlformats.org/markup-compatibility/2006" xmlns:r="http://schemas.openxmlformats.org/officeDocument/2006/relationships" xmlns:w="http://schemas.openxmlformats.org/wordprocessingml/2006/main" xmlns:w14="http://schemas.microsoft.com/office/word/2010/wordml" xmlns:w15="http://schemas.microsoft.com/office/word/2012/wordml" mc:Ignorable="w14 w15">
+<w:styles xmlns:mc="http://schemas.openxmlformats.org/markup-compatibility/2006" xmlns:r="http://schemas.openxmlformats.org/officeDocument/2006/relationships" xmlns:w="http://schemas.openxmlformats.org/wordprocessingml/2006/main" xmlns:w14="http://schemas.microsoft.com/office/word/2010/wordml" xmlns:w15="http://schemas.microsoft.com/office/word/2012/wordml" xmlns:w16cex="http://schemas.microsoft.com/office/word/2018/wordml/cex" xmlns:w16cid="http://schemas.microsoft.com/office/word/2016/wordml/cid" xmlns:w16="http://schemas.microsoft.com/office/word/2018/wordml" xmlns:w16du="http://schemas.microsoft.com/office/word/2023/wordml/word16du" xmlns:w16sdtdh="http://schemas.microsoft.com/office/word/2020/wordml/sdtdatahash" xmlns:w16sdtfl="http://schemas.microsoft.com/office/word/2024/wordml/sdtformatlock" xmlns:w16se="http://schemas.microsoft.com/office/word/2015/wordml/symex" mc:Ignorable="w14 w15 w16se w16cid w16 w16cex w16sdtdh w16sdtfl w16du">
   <w:docDefaults>
     <w:rPrDefault>
       <w:rPr>
@@ -29969,7 +30020,7 @@
     </w:rPrDefault>
     <w:pPrDefault/>
   </w:docDefaults>
-  <w:latentStyles w:defLockedState="0" w:defUIPriority="99" w:defSemiHidden="0" w:defUnhideWhenUsed="0" w:defQFormat="0" w:count="371">
+  <w:latentStyles w:defLockedState="0" w:defUIPriority="99" w:defSemiHidden="0" w:defUnhideWhenUsed="0" w:defQFormat="0" w:count="376">
     <w:lsdException w:name="Normal" w:uiPriority="0" w:qFormat="1"/>
     <w:lsdException w:name="heading 1" w:uiPriority="9" w:qFormat="1"/>
     <w:lsdException w:name="heading 2" w:semiHidden="1" w:uiPriority="9" w:unhideWhenUsed="1" w:qFormat="1"/>
@@ -30341,6 +30392,11 @@
     <w:lsdException w:name="List Table 5 Dark Accent 6" w:uiPriority="50"/>
     <w:lsdException w:name="List Table 6 Colorful Accent 6" w:uiPriority="51"/>
     <w:lsdException w:name="List Table 7 Colorful Accent 6" w:uiPriority="52"/>
+    <w:lsdException w:name="Mention" w:semiHidden="1" w:unhideWhenUsed="1"/>
+    <w:lsdException w:name="Smart Hyperlink" w:semiHidden="1" w:unhideWhenUsed="1"/>
+    <w:lsdException w:name="Hashtag" w:semiHidden="1" w:unhideWhenUsed="1"/>
+    <w:lsdException w:name="Unresolved Mention" w:semiHidden="1" w:unhideWhenUsed="1"/>
+    <w:lsdException w:name="Smart Link" w:semiHidden="1" w:unhideWhenUsed="1"/>
   </w:latentStyles>
   <w:style w:type="paragraph" w:default="1" w:styleId="Normal">
     <w:name w:val="Normal"/>
@@ -31250,7 +31306,7 @@
 </file>
 
 <file path=customXml/itemProps1.xml><?xml version="1.0" encoding="utf-8"?>
-<ds:datastoreItem xmlns:ds="http://schemas.openxmlformats.org/officeDocument/2006/customXml" ds:itemID="{F5B4C708-C2E4-4898-90D1-D8C06FE3BF47}">
+<ds:datastoreItem xmlns:ds="http://schemas.openxmlformats.org/officeDocument/2006/customXml" ds:itemID="{C883A1F5-ABBF-7444-BEB4-30C0E8324994}">
   <ds:schemaRefs>
     <ds:schemaRef ds:uri="http://schemas.openxmlformats.org/officeDocument/2006/bibliography"/>
   </ds:schemaRefs>

</xml_diff>

<commit_message>
Update STET input docs
</commit_message>
<xml_diff>
--- a/backend/stet/data/stet_en.docx
+++ b/backend/stet/data/stet_en.docx
@@ -6950,28 +6950,18 @@
           </w:p>
           <w:p>
             <w:r>
-              <w:t>Galatians 2:16</w:t>
-            </w:r>
-          </w:p>
-          <w:p>
-            <w:r>
-              <w:t>Galatians 2:</w:t>
-            </w:r>
-            <w:r>
-              <w:t>20</w:t>
+              <w:t>Galatians 2:16, 20</w:t>
             </w:r>
           </w:p>
           <w:p>
             <w:r>
               <w:t>Galatians 5:19</w:t>
             </w:r>
-          </w:p>
-          <w:p>
-            <w:r>
-              <w:t>Galatians 5:</w:t>
-            </w:r>
-            <w:r>
-              <w:t>24</w:t>
+            <w:r>
+              <w:t>,</w:t>
+            </w:r>
+            <w:r>
+              <w:t xml:space="preserve"> 24</w:t>
             </w:r>
           </w:p>
           <w:p>
@@ -7023,23 +7013,14 @@
                 <w:bCs/>
               </w:rPr>
             </w:pPr>
-            <w:proofErr w:type="spellStart"/>
             <w:r>
               <w:rPr>
                 <w:b/>
                 <w:bCs/>
               </w:rPr>
               <w:lastRenderedPageBreak/>
-              <w:t>f</w:t>
-            </w:r>
-            <w:r>
-              <w:rPr>
-                <w:b/>
-                <w:bCs/>
-              </w:rPr>
-              <w:t>know</w:t>
-            </w:r>
-            <w:proofErr w:type="spellEnd"/>
+              <w:t>foreknow</w:t>
+            </w:r>
           </w:p>
           <w:p>
             <w:r>
@@ -8855,15 +8836,7 @@
           </w:tcPr>
           <w:p>
             <w:r>
-              <w:t xml:space="preserve">Matthew 3:16 </w:t>
-            </w:r>
-          </w:p>
-          <w:p>
-            <w:r>
-              <w:t>Matthew 3:</w:t>
-            </w:r>
-            <w:r>
-              <w:t>17</w:t>
+              <w:t>Matthew 3:16, 17</w:t>
             </w:r>
           </w:p>
           <w:p>

</xml_diff>

<commit_message>
Update STET input files
Update stet_en.docx and stet_pt-br.docx and add stet_es-419.docx. I
had to change references to Filemon to Filemom in stet_pt-br.docx.
Filemom appears to be the correct spelling and indeed DOC expects it
so.
</commit_message>
<xml_diff>
--- a/backend/stet/data/stet_en.docx
+++ b/backend/stet/data/stet_en.docx
@@ -929,7 +929,13 @@
               <w:pStyle w:val="Compact"/>
             </w:pPr>
             <w:r>
-              <w:t>Hebrews 11:6</w:t>
+              <w:t>Hebrews 11:</w:t>
+            </w:r>
+            <w:r>
+              <w:t>1</w:t>
+            </w:r>
+            <w:r>
+              <w:t>6</w:t>
             </w:r>
           </w:p>
           <w:p>
@@ -1820,11 +1826,6 @@
           </w:p>
           <w:p>
             <w:r>
-              <w:t>Hebrews 8:7</w:t>
-            </w:r>
-          </w:p>
-          <w:p>
-            <w:r>
               <w:t>Hebrews 9:14</w:t>
             </w:r>
           </w:p>
@@ -1855,6 +1856,13 @@
                 <w:bCs/>
               </w:rPr>
               <w:t>blameless, blamelessly, unblemished, without blemish</w:t>
+            </w:r>
+            <w:r>
+              <w:rPr>
+                <w:b/>
+                <w:bCs/>
+              </w:rPr>
+              <w:t>, faultless</w:t>
             </w:r>
           </w:p>
         </w:tc>
@@ -1943,27 +1951,21 @@
           </w:p>
           <w:p>
             <w:r>
-              <w:t>Ephesians 4:31</w:t>
-            </w:r>
-          </w:p>
-          <w:p>
-            <w:r>
-              <w:t>Colossians 3:8</w:t>
-            </w:r>
-          </w:p>
-          <w:p>
-            <w:r>
               <w:t>1 Timothy 1:20</w:t>
             </w:r>
           </w:p>
           <w:p>
             <w:r>
-              <w:t>Jude 1:9</w:t>
-            </w:r>
-          </w:p>
-          <w:p>
-            <w:r>
-              <w:t>Revelation 2:9</w:t>
+              <w:t xml:space="preserve">Revelation </w:t>
+            </w:r>
+            <w:r>
+              <w:t>13</w:t>
+            </w:r>
+            <w:r>
+              <w:t>:</w:t>
+            </w:r>
+            <w:r>
+              <w:t>6</w:t>
             </w:r>
           </w:p>
           <w:p>
@@ -4021,7 +4023,10 @@
           </w:p>
           <w:p>
             <w:r>
-              <w:t>Galatians 2:20</w:t>
+              <w:t>Galatians 2:</w:t>
+            </w:r>
+            <w:r>
+              <w:t>19</w:t>
             </w:r>
           </w:p>
           <w:p>
@@ -5286,14 +5291,6 @@
               <w:pStyle w:val="Compact"/>
             </w:pPr>
             <w:r>
-              <w:t xml:space="preserve">Acts 17:29 </w:t>
-            </w:r>
-          </w:p>
-          <w:p>
-            <w:pPr>
-              <w:pStyle w:val="Compact"/>
-            </w:pPr>
-            <w:r>
               <w:t xml:space="preserve">Romans 1:20 </w:t>
             </w:r>
           </w:p>
@@ -5330,7 +5327,14 @@
                 <w:b/>
                 <w:bCs/>
               </w:rPr>
-              <w:t>divine</w:t>
+              <w:t>d</w:t>
+            </w:r>
+            <w:r>
+              <w:rPr>
+                <w:b/>
+                <w:bCs/>
+              </w:rPr>
+              <w:t>ivine</w:t>
             </w:r>
           </w:p>
           <w:p>
@@ -5919,7 +5923,16 @@
           </w:p>
           <w:p>
             <w:r>
-              <w:t>2 Timothy 1:9</w:t>
+              <w:t xml:space="preserve">2 Timothy </w:t>
+            </w:r>
+            <w:r>
+              <w:t>2</w:t>
+            </w:r>
+            <w:r>
+              <w:t>:</w:t>
+            </w:r>
+            <w:r>
+              <w:t>10</w:t>
             </w:r>
           </w:p>
           <w:p>
@@ -6600,18 +6613,6 @@
               </w:numPr>
             </w:pPr>
             <w:r>
-              <w:t>Parents.</w:t>
-            </w:r>
-          </w:p>
-          <w:p>
-            <w:pPr>
-              <w:pStyle w:val="ListParagraph"/>
-              <w:numPr>
-                <w:ilvl w:val="0"/>
-                <w:numId w:val="24"/>
-              </w:numPr>
-            </w:pPr>
-            <w:r>
               <w:t>An ancestor.</w:t>
             </w:r>
           </w:p>
@@ -6935,7 +6936,10 @@
           </w:p>
           <w:p>
             <w:r>
-              <w:t>Romans 8:1</w:t>
+              <w:t>Romans 8:</w:t>
+            </w:r>
+            <w:r>
+              <w:t>3</w:t>
             </w:r>
           </w:p>
           <w:p>
@@ -6950,18 +6954,28 @@
           </w:p>
           <w:p>
             <w:r>
-              <w:t>Galatians 2:16, 20</w:t>
+              <w:t>Galatians 2:16</w:t>
+            </w:r>
+          </w:p>
+          <w:p>
+            <w:r>
+              <w:t>Galatians 2:</w:t>
+            </w:r>
+            <w:r>
+              <w:t>20</w:t>
             </w:r>
           </w:p>
           <w:p>
             <w:r>
               <w:t>Galatians 5:19</w:t>
             </w:r>
-            <w:r>
-              <w:t>,</w:t>
-            </w:r>
-            <w:r>
-              <w:t xml:space="preserve"> 24</w:t>
+          </w:p>
+          <w:p>
+            <w:r>
+              <w:t>Galatians 5:</w:t>
+            </w:r>
+            <w:r>
+              <w:t>24</w:t>
             </w:r>
           </w:p>
           <w:p>
@@ -7019,7 +7033,21 @@
                 <w:bCs/>
               </w:rPr>
               <w:lastRenderedPageBreak/>
-              <w:t>foreknow</w:t>
+              <w:t>f</w:t>
+            </w:r>
+            <w:r>
+              <w:rPr>
+                <w:b/>
+                <w:bCs/>
+              </w:rPr>
+              <w:t>ore</w:t>
+            </w:r>
+            <w:r>
+              <w:rPr>
+                <w:b/>
+                <w:bCs/>
+              </w:rPr>
+              <w:t>know</w:t>
             </w:r>
           </w:p>
           <w:p>
@@ -7647,7 +7675,16 @@
           </w:tcPr>
           <w:p>
             <w:r>
-              <w:t>Matthew 6:13</w:t>
+              <w:t xml:space="preserve">Matthew </w:t>
+            </w:r>
+            <w:r>
+              <w:t>25</w:t>
+            </w:r>
+            <w:r>
+              <w:t>:</w:t>
+            </w:r>
+            <w:r>
+              <w:t>31</w:t>
             </w:r>
           </w:p>
           <w:p>
@@ -8520,15 +8557,8 @@
               <w:rPr>
                 <w:b/>
                 <w:bCs/>
-                <w:highlight w:val="yellow"/>
               </w:rPr>
               <w:t>favor</w:t>
-            </w:r>
-            <w:r>
-              <w:rPr>
-                <w:highlight w:val="yellow"/>
-              </w:rPr>
-              <w:t>:</w:t>
             </w:r>
           </w:p>
         </w:tc>
@@ -8836,7 +8866,15 @@
           </w:tcPr>
           <w:p>
             <w:r>
-              <w:t>Matthew 3:16, 17</w:t>
+              <w:t xml:space="preserve">Matthew 3:16 </w:t>
+            </w:r>
+          </w:p>
+          <w:p>
+            <w:r>
+              <w:t>Matthew 3:</w:t>
+            </w:r>
+            <w:r>
+              <w:t>17</w:t>
             </w:r>
           </w:p>
           <w:p>
@@ -8892,11 +8930,6 @@
           <w:p>
             <w:r>
               <w:t>2 Peter 1:18</w:t>
-            </w:r>
-          </w:p>
-          <w:p>
-            <w:r>
-              <w:t>1 John 5:7</w:t>
             </w:r>
           </w:p>
           <w:p>
@@ -15433,9 +15466,6 @@
                 <w:bCs/>
               </w:rPr>
               <w:t>innocent</w:t>
-            </w:r>
-            <w:r>
-              <w:t>:</w:t>
             </w:r>
           </w:p>
         </w:tc>

</xml_diff>

<commit_message>
Updated STET input docs for en, es-419, pt-br
</commit_message>
<xml_diff>
--- a/backend/stet/data/stet_en.docx
+++ b/backend/stet/data/stet_en.docx
@@ -6327,6 +6327,11 @@
               <w:t>1 Timothy 6:12</w:t>
             </w:r>
           </w:p>
+          <w:p>
+            <w:r>
+              <w:t>1 Peter 1:21</w:t>
+            </w:r>
+          </w:p>
         </w:tc>
         <w:tc>
           <w:tcPr>
@@ -6493,11 +6498,6 @@
           </w:p>
           <w:p>
             <w:r>
-              <w:t>1 Peter 1:21</w:t>
-            </w:r>
-          </w:p>
-          <w:p>
-            <w:r>
               <w:t>3 John 1:5</w:t>
             </w:r>
           </w:p>
@@ -9148,6 +9148,14 @@
               <w:pStyle w:val="Compact"/>
             </w:pPr>
             <w:r>
+              <w:t xml:space="preserve">Ephesians 3:6 </w:t>
+            </w:r>
+          </w:p>
+          <w:p>
+            <w:pPr>
+              <w:pStyle w:val="Compact"/>
+            </w:pPr>
+            <w:r>
               <w:t xml:space="preserve">Titus 3:7 </w:t>
             </w:r>
           </w:p>
@@ -9173,14 +9181,6 @@
             </w:pPr>
             <w:r>
               <w:t xml:space="preserve">James 2:5 </w:t>
-            </w:r>
-          </w:p>
-          <w:p>
-            <w:pPr>
-              <w:pStyle w:val="Compact"/>
-            </w:pPr>
-            <w:r>
-              <w:t xml:space="preserve">Ephesians 3:6 </w:t>
             </w:r>
           </w:p>
           <w:p>
@@ -10771,24 +10771,8 @@
               <w:t>To condemn, which means to sentence someone or declare what punishment a person will receive for doing something wrong.</w:t>
             </w:r>
           </w:p>
-          <w:p>
-            <w:pPr>
-              <w:pStyle w:val="ListParagraph"/>
-              <w:numPr>
-                <w:ilvl w:val="0"/>
-                <w:numId w:val="36"/>
-              </w:numPr>
-            </w:pPr>
-            <w:r>
-              <w:t>The person in a court of law who makes the decision about whether someone did what was right or wrong.</w:t>
-            </w:r>
-          </w:p>
           <w:p/>
-          <w:p>
-            <w:r>
-              <w:t>Sometimes this word is also used to talk about God or Jesus as the great judge.</w:t>
-            </w:r>
-          </w:p>
+          <w:p/>
         </w:tc>
         <w:tc>
           <w:tcPr>
@@ -12059,6 +12043,13 @@
               </w:rPr>
               <w:t>Lord</w:t>
             </w:r>
+            <w:r>
+              <w:rPr>
+                <w:b/>
+                <w:bCs/>
+              </w:rPr>
+              <w:t>, lord</w:t>
+            </w:r>
           </w:p>
           <w:p>
             <w:r>
@@ -14310,6 +14301,15 @@
           <w:p/>
           <w:p>
             <w:r>
+              <w:t xml:space="preserve">This </w:t>
+            </w:r>
+            <w:r>
+              <w:t>word can also mean the act of speaking such a message to other people.</w:t>
+            </w:r>
+          </w:p>
+          <w:p/>
+          <w:p>
+            <w:r>
               <w:t>Note: Verses with * symbols should all use the same meaning of this word.</w:t>
             </w:r>
           </w:p>
@@ -15546,13 +15546,24 @@
               <w:t>Something that is like an offering or sacrifice in some way.</w:t>
             </w:r>
           </w:p>
+          <w:p>
+            <w:pPr>
+              <w:pStyle w:val="ListParagraph"/>
+              <w:numPr>
+                <w:ilvl w:val="0"/>
+                <w:numId w:val="56"/>
+              </w:numPr>
+            </w:pPr>
+            <w:r>
+              <w:t>The act of giving something valuable (that can be alive) to someone or to God.</w:t>
+            </w:r>
+          </w:p>
           <w:p/>
           <w:p>
             <w:r>
               <w:t>At the time of the New Testament, many sacrifices were animals that were killed, so “to sacrifice” can also mean “to kill” when applied to something living.</w:t>
             </w:r>
           </w:p>
-          <w:p/>
         </w:tc>
         <w:tc>
           <w:tcPr>
@@ -17959,11 +17970,6 @@
           <w:p>
             <w:r>
               <w:t xml:space="preserve">James 2:26 </w:t>
-            </w:r>
-          </w:p>
-          <w:p>
-            <w:r>
-              <w:t xml:space="preserve">1 Peter 1:2 </w:t>
             </w:r>
           </w:p>
           <w:p>

</xml_diff>

<commit_message>
Updated STET input docs
PO provided new input docs
</commit_message>
<xml_diff>
--- a/backend/stet/data/stet_en.docx
+++ b/backend/stet/data/stet_en.docx
@@ -1154,7 +1154,21 @@
                 <w:b/>
                 <w:bCs/>
               </w:rPr>
-              <w:t>authority</w:t>
+              <w:t>a</w:t>
+            </w:r>
+            <w:r>
+              <w:rPr>
+                <w:b/>
+                <w:bCs/>
+              </w:rPr>
+              <w:t>uthority</w:t>
+            </w:r>
+            <w:r>
+              <w:rPr>
+                <w:b/>
+                <w:bCs/>
+              </w:rPr>
+              <w:t>, authorities</w:t>
             </w:r>
           </w:p>
           <w:p/>
@@ -1986,6 +2000,13 @@
               </w:rPr>
               <w:t>blaspheme, blaspheming, blasphemous, insulted</w:t>
             </w:r>
+            <w:r>
+              <w:rPr>
+                <w:b/>
+                <w:bCs/>
+              </w:rPr>
+              <w:t>, blasphemies, blasphemy</w:t>
+            </w:r>
           </w:p>
         </w:tc>
       </w:tr>
@@ -2016,7 +2037,13 @@
           </w:p>
           <w:p>
             <w:r>
-              <w:t>G3107, G3106, G3105, G2129, G2128, G2127, G1757</w:t>
+              <w:t>G3107, G3106, G310</w:t>
+            </w:r>
+            <w:r>
+              <w:t>8</w:t>
+            </w:r>
+            <w:r>
+              <w:t>, G2129, G2128, G2127, G1757</w:t>
             </w:r>
           </w:p>
         </w:tc>
@@ -2077,7 +2104,7 @@
               </w:numPr>
             </w:pPr>
             <w:r>
-              <w:t xml:space="preserve">To thank and praise God for providing a food or a meal. </w:t>
+              <w:t xml:space="preserve">To thank and praise God for providing food or a meal. </w:t>
             </w:r>
           </w:p>
           <w:p>
@@ -2583,7 +2610,16 @@
           </w:tcPr>
           <w:p>
             <w:r>
-              <w:t>Christ is the name of the title given to Jesus. Its literal meaning is the Anointed One.</w:t>
+              <w:t xml:space="preserve">Christ is the name of the title given to Jesus. Its literal meaning is </w:t>
+            </w:r>
+            <w:r>
+              <w:t>“</w:t>
+            </w:r>
+            <w:r>
+              <w:t>the Anointed One.</w:t>
+            </w:r>
+            <w:r>
+              <w:t>”</w:t>
             </w:r>
           </w:p>
         </w:tc>
@@ -3299,10 +3335,28 @@
               <w:t>s</w:t>
             </w:r>
             <w:r>
-              <w:t xml:space="preserve"> to judge someone to be guilty</w:t>
-            </w:r>
-            <w:r>
-              <w:t xml:space="preserve"> and to deserve </w:t>
+              <w:t xml:space="preserve"> to judge </w:t>
+            </w:r>
+            <w:r>
+              <w:t xml:space="preserve">that </w:t>
+            </w:r>
+            <w:r>
+              <w:t xml:space="preserve">someone </w:t>
+            </w:r>
+            <w:r>
+              <w:t>is</w:t>
+            </w:r>
+            <w:r>
+              <w:t xml:space="preserve"> guilty</w:t>
+            </w:r>
+            <w:r>
+              <w:t xml:space="preserve"> and deserve</w:t>
+            </w:r>
+            <w:r>
+              <w:t>s</w:t>
+            </w:r>
+            <w:r>
+              <w:t xml:space="preserve"> </w:t>
             </w:r>
             <w:r>
               <w:t>punishment for doing someth</w:t>
@@ -5420,15 +5474,15 @@
               <w:pStyle w:val="Compact"/>
             </w:pPr>
             <w:r>
+              <w:t>Mark 13:20</w:t>
+            </w:r>
+          </w:p>
+          <w:p>
+            <w:pPr>
+              <w:pStyle w:val="Compact"/>
+            </w:pPr>
+            <w:r>
               <w:t>Luke 23:35</w:t>
-            </w:r>
-          </w:p>
-          <w:p>
-            <w:pPr>
-              <w:pStyle w:val="Compact"/>
-            </w:pPr>
-            <w:r>
-              <w:t>Mark 13:20</w:t>
             </w:r>
           </w:p>
           <w:p>
@@ -7222,7 +7276,13 @@
               </w:numPr>
             </w:pPr>
             <w:r>
-              <w:t>To release a prisoner, allowing him to go free.</w:t>
+              <w:t xml:space="preserve">To release a prisoner, allowing </w:t>
+            </w:r>
+            <w:r>
+              <w:t>that prisoner</w:t>
+            </w:r>
+            <w:r>
+              <w:t xml:space="preserve"> to go free.</w:t>
             </w:r>
           </w:p>
           <w:p>
@@ -7664,7 +7724,7 @@
               </w:numPr>
             </w:pPr>
             <w:r>
-              <w:t>The praise or honor that someone gives to someone else, and especially the praise and honor that belongs to God.</w:t>
+              <w:t>The praise or honor that someone gives to someone else, and especially the praise and honor that belong to God.</w:t>
             </w:r>
           </w:p>
           <w:p/>
@@ -13410,7 +13470,10 @@
               </w:numPr>
             </w:pPr>
             <w:r>
-              <w:t xml:space="preserve">In a good relationship with other people. </w:t>
+              <w:t>Being i</w:t>
+            </w:r>
+            <w:r>
+              <w:t xml:space="preserve">n a good relationship with other people. </w:t>
             </w:r>
           </w:p>
           <w:p>
@@ -17371,7 +17434,19 @@
               </w:numPr>
             </w:pPr>
             <w:r>
-              <w:t>The word used to translate “Son” should fit with the word used to translate “Father” and should be the most natural ones used to express a true father-son relationship in the language.</w:t>
+              <w:t>The word used to translate “Son” should fit with the word used to translate “Father</w:t>
+            </w:r>
+            <w:r>
+              <w:t>.</w:t>
+            </w:r>
+            <w:r>
+              <w:t xml:space="preserve">” </w:t>
+            </w:r>
+            <w:r>
+              <w:t>These words</w:t>
+            </w:r>
+            <w:r>
+              <w:t xml:space="preserve"> should be the most natural ones used to express a true father-son relationship in the language.</w:t>
             </w:r>
           </w:p>
         </w:tc>
@@ -18991,7 +19066,7 @@
               </w:numPr>
             </w:pPr>
             <w:r>
-              <w:t>What God plans for the rest of his creation.</w:t>
+              <w:t>What God plans for his creation.</w:t>
             </w:r>
           </w:p>
           <w:p>

</xml_diff>

<commit_message>
Update EN, FR, PT-BR, SW, and TPI STET input docs
Provided by PO
</commit_message>
<xml_diff>
--- a/backend/stet/data/stet_en.docx
+++ b/backend/stet/data/stet_en.docx
@@ -55,7 +55,16 @@
           </w:tcPr>
           <w:p>
             <w:r>
-              <w:t xml:space="preserve">This Greek word is used for “father” by a beloved child. </w:t>
+              <w:t xml:space="preserve">The Greek New Testament took this loan </w:t>
+            </w:r>
+            <w:r>
+              <w:t>word</w:t>
+            </w:r>
+            <w:r>
+              <w:t xml:space="preserve"> from Aramaic. It </w:t>
+            </w:r>
+            <w:r>
+              <w:t xml:space="preserve">is used for “father” by a beloved child. </w:t>
             </w:r>
           </w:p>
           <w:p>
@@ -84,7 +93,7 @@
           </w:p>
           <w:p>
             <w:r>
-              <w:t>Most translations transliterate this from the Greek word.</w:t>
+              <w:t xml:space="preserve">In most translations, this word is made to sound or to be spelled as it was in the Bible’s original languages. </w:t>
             </w:r>
           </w:p>
         </w:tc>

</xml_diff>

<commit_message>
Update STET input docs and string table
</commit_message>
<xml_diff>
--- a/backend/stet/data/stet_en.docx
+++ b/backend/stet/data/stet_en.docx
@@ -1,6 +1,6 @@
 
 <file path=word/document.xml><?xml version="1.0" encoding="utf-8"?>
-<w:document xmlns:wpc="http://schemas.microsoft.com/office/word/2010/wordprocessingCanvas" xmlns:cx="http://schemas.microsoft.com/office/drawing/2014/chartex" xmlns:cx1="http://schemas.microsoft.com/office/drawing/2015/9/8/chartex" xmlns:cx2="http://schemas.microsoft.com/office/drawing/2015/10/21/chartex" xmlns:cx3="http://schemas.microsoft.com/office/drawing/2016/5/9/chartex" xmlns:cx4="http://schemas.microsoft.com/office/drawing/2016/5/10/chartex" xmlns:cx5="http://schemas.microsoft.com/office/drawing/2016/5/11/chartex" xmlns:cx6="http://schemas.microsoft.com/office/drawing/2016/5/12/chartex" xmlns:cx7="http://schemas.microsoft.com/office/drawing/2016/5/13/chartex" xmlns:cx8="http://schemas.microsoft.com/office/drawing/2016/5/14/chartex" xmlns:mc="http://schemas.openxmlformats.org/markup-compatibility/2006" xmlns:aink="http://schemas.microsoft.com/office/drawing/2016/ink" xmlns:am3d="http://schemas.microsoft.com/office/drawing/2017/model3d" xmlns:o="urn:schemas-microsoft-com:office:office" xmlns:oel="http://schemas.microsoft.com/office/2019/extlst" xmlns:r="http://schemas.openxmlformats.org/officeDocument/2006/relationships" xmlns:m="http://schemas.openxmlformats.org/officeDocument/2006/math" xmlns:v="urn:schemas-microsoft-com:vml" xmlns:wp14="http://schemas.microsoft.com/office/word/2010/wordprocessingDrawing" xmlns:wp="http://schemas.openxmlformats.org/drawingml/2006/wordprocessingDrawing" xmlns:w10="urn:schemas-microsoft-com:office:word" xmlns:w="http://schemas.openxmlformats.org/wordprocessingml/2006/main" xmlns:w14="http://schemas.microsoft.com/office/word/2010/wordml" xmlns:w15="http://schemas.microsoft.com/office/word/2012/wordml" xmlns:w16cex="http://schemas.microsoft.com/office/word/2018/wordml/cex" xmlns:w16cid="http://schemas.microsoft.com/office/word/2016/wordml/cid" xmlns:w16="http://schemas.microsoft.com/office/word/2018/wordml" xmlns:w16du="http://schemas.microsoft.com/office/word/2023/wordml/word16du" xmlns:w16sdtdh="http://schemas.microsoft.com/office/word/2020/wordml/sdtdatahash" xmlns:w16sdtfl="http://schemas.microsoft.com/office/word/2024/wordml/sdtformatlock" xmlns:w16se="http://schemas.microsoft.com/office/word/2015/wordml/symex" xmlns:wpg="http://schemas.microsoft.com/office/word/2010/wordprocessingGroup" xmlns:wpi="http://schemas.microsoft.com/office/word/2010/wordprocessingInk" xmlns:wne="http://schemas.microsoft.com/office/word/2006/wordml" xmlns:wps="http://schemas.microsoft.com/office/word/2010/wordprocessingShape" mc:Ignorable="w14 w15 w16se w16cid w16 w16cex w16sdtdh w16sdtfl w16du wp14">
+<w:document xmlns:wpc="http://schemas.microsoft.com/office/word/2010/wordprocessingCanvas" xmlns:cx="http://schemas.microsoft.com/office/drawing/2014/chartex" xmlns:cx1="http://schemas.microsoft.com/office/drawing/2015/9/8/chartex" xmlns:cx2="http://schemas.microsoft.com/office/drawing/2015/10/21/chartex" xmlns:cx3="http://schemas.microsoft.com/office/drawing/2016/5/9/chartex" xmlns:cx4="http://schemas.microsoft.com/office/drawing/2016/5/10/chartex" xmlns:cx5="http://schemas.microsoft.com/office/drawing/2016/5/11/chartex" xmlns:cx6="http://schemas.microsoft.com/office/drawing/2016/5/12/chartex" xmlns:cx7="http://schemas.microsoft.com/office/drawing/2016/5/13/chartex" xmlns:cx8="http://schemas.microsoft.com/office/drawing/2016/5/14/chartex" xmlns:mc="http://schemas.openxmlformats.org/markup-compatibility/2006" xmlns:m="http://schemas.openxmlformats.org/officeDocument/2006/math" xmlns:aink="http://schemas.microsoft.com/office/drawing/2016/ink" xmlns:am3d="http://schemas.microsoft.com/office/drawing/2017/model3d" xmlns:oel="http://schemas.microsoft.com/office/2019/extlst" xmlns:r="http://schemas.openxmlformats.org/officeDocument/2006/relationships" xmlns:wp14="http://schemas.microsoft.com/office/word/2010/wordprocessingDrawing" xmlns:wp="http://schemas.openxmlformats.org/drawingml/2006/wordprocessingDrawing" xmlns:wpg="http://schemas.microsoft.com/office/word/2010/wordprocessingGroup" xmlns:wpi="http://schemas.microsoft.com/office/word/2010/wordprocessingInk" xmlns:wps="http://schemas.microsoft.com/office/word/2010/wordprocessingShape" xmlns:o="urn:schemas-microsoft-com:office:office" xmlns:v="urn:schemas-microsoft-com:vml" xmlns:w10="urn:schemas-microsoft-com:office:word" xmlns:w="http://schemas.openxmlformats.org/wordprocessingml/2006/main" xmlns:w14="http://schemas.microsoft.com/office/word/2010/wordml" xmlns:w15="http://schemas.microsoft.com/office/word/2012/wordml" xmlns:w16cex="http://schemas.microsoft.com/office/word/2018/wordml/cex" xmlns:w16cid="http://schemas.microsoft.com/office/word/2016/wordml/cid" xmlns:w16="http://schemas.microsoft.com/office/word/2018/wordml" xmlns:w16sdtdh="http://schemas.microsoft.com/office/word/2020/wordml/sdtdatahash" xmlns:w16sdtfl="http://schemas.microsoft.com/office/word/2024/wordml/sdtformatlock" xmlns:w16se="http://schemas.microsoft.com/office/word/2015/wordml/symex" xmlns:w16du="http://schemas.microsoft.com/office/word/2023/wordml/word16du" xmlns:wne="http://schemas.microsoft.com/office/word/2006/wordml" mc:Ignorable="w14 w15 w16se w16cid w16 w16cex w16sdtdh w16sdtfl w16du wp14">
   <w:body>
     <w:tbl>
       <w:tblPr>
@@ -5171,6 +5171,9 @@
             <w:r>
               <w:t>G818, G819</w:t>
             </w:r>
+            <w:r>
+              <w:t>, G820</w:t>
+            </w:r>
           </w:p>
         </w:tc>
         <w:tc>
@@ -5215,11 +5218,6 @@
           <w:p>
             <w:r>
               <w:t xml:space="preserve">Romans 2:23 </w:t>
-            </w:r>
-          </w:p>
-          <w:p>
-            <w:r>
-              <w:t xml:space="preserve">Romans 9:21 </w:t>
             </w:r>
           </w:p>
           <w:p>
@@ -12262,7 +12260,16 @@
           </w:p>
           <w:p>
             <w:r>
-              <w:t>G26, G27</w:t>
+              <w:t>G2</w:t>
+            </w:r>
+            <w:r>
+              <w:t>5</w:t>
+            </w:r>
+            <w:r>
+              <w:t>, G2</w:t>
+            </w:r>
+            <w:r>
+              <w:t>6</w:t>
             </w:r>
           </w:p>
         </w:tc>
@@ -17839,11 +17846,6 @@
           </w:p>
           <w:p>
             <w:r>
-              <w:t>2 Corinthians 1:23</w:t>
-            </w:r>
-          </w:p>
-          <w:p>
-            <w:r>
               <w:t>1 Thessalonians 5:23</w:t>
             </w:r>
           </w:p>
@@ -18038,7 +18040,19 @@
           </w:p>
           <w:p>
             <w:r>
-              <w:t xml:space="preserve">Philippians 4:23 </w:t>
+              <w:t xml:space="preserve">Philippians </w:t>
+            </w:r>
+            <w:r>
+              <w:t>1</w:t>
+            </w:r>
+            <w:r>
+              <w:t>:2</w:t>
+            </w:r>
+            <w:r>
+              <w:t>7</w:t>
+            </w:r>
+            <w:r>
+              <w:t xml:space="preserve"> </w:t>
             </w:r>
           </w:p>
           <w:p>
@@ -20316,7 +20330,7 @@
 </file>
 
 <file path=word/numbering.xml><?xml version="1.0" encoding="utf-8"?>
-<w:numbering xmlns:wpc="http://schemas.microsoft.com/office/word/2010/wordprocessingCanvas" xmlns:cx="http://schemas.microsoft.com/office/drawing/2014/chartex" xmlns:cx1="http://schemas.microsoft.com/office/drawing/2015/9/8/chartex" xmlns:cx2="http://schemas.microsoft.com/office/drawing/2015/10/21/chartex" xmlns:cx3="http://schemas.microsoft.com/office/drawing/2016/5/9/chartex" xmlns:cx4="http://schemas.microsoft.com/office/drawing/2016/5/10/chartex" xmlns:cx5="http://schemas.microsoft.com/office/drawing/2016/5/11/chartex" xmlns:cx6="http://schemas.microsoft.com/office/drawing/2016/5/12/chartex" xmlns:cx7="http://schemas.microsoft.com/office/drawing/2016/5/13/chartex" xmlns:cx8="http://schemas.microsoft.com/office/drawing/2016/5/14/chartex" xmlns:mc="http://schemas.openxmlformats.org/markup-compatibility/2006" xmlns:aink="http://schemas.microsoft.com/office/drawing/2016/ink" xmlns:am3d="http://schemas.microsoft.com/office/drawing/2017/model3d" xmlns:o="urn:schemas-microsoft-com:office:office" xmlns:oel="http://schemas.microsoft.com/office/2019/extlst" xmlns:r="http://schemas.openxmlformats.org/officeDocument/2006/relationships" xmlns:m="http://schemas.openxmlformats.org/officeDocument/2006/math" xmlns:v="urn:schemas-microsoft-com:vml" xmlns:wp14="http://schemas.microsoft.com/office/word/2010/wordprocessingDrawing" xmlns:wp="http://schemas.openxmlformats.org/drawingml/2006/wordprocessingDrawing" xmlns:w10="urn:schemas-microsoft-com:office:word" xmlns:w="http://schemas.openxmlformats.org/wordprocessingml/2006/main" xmlns:w14="http://schemas.microsoft.com/office/word/2010/wordml" xmlns:w15="http://schemas.microsoft.com/office/word/2012/wordml" xmlns:w16cex="http://schemas.microsoft.com/office/word/2018/wordml/cex" xmlns:w16cid="http://schemas.microsoft.com/office/word/2016/wordml/cid" xmlns:w16="http://schemas.microsoft.com/office/word/2018/wordml" xmlns:w16du="http://schemas.microsoft.com/office/word/2023/wordml/word16du" xmlns:w16sdtdh="http://schemas.microsoft.com/office/word/2020/wordml/sdtdatahash" xmlns:w16sdtfl="http://schemas.microsoft.com/office/word/2024/wordml/sdtformatlock" xmlns:w16se="http://schemas.microsoft.com/office/word/2015/wordml/symex" xmlns:wpg="http://schemas.microsoft.com/office/word/2010/wordprocessingGroup" xmlns:wpi="http://schemas.microsoft.com/office/word/2010/wordprocessingInk" xmlns:wne="http://schemas.microsoft.com/office/word/2006/wordml" xmlns:wps="http://schemas.microsoft.com/office/word/2010/wordprocessingShape" mc:Ignorable="w14 w15 w16se w16cid w16 w16cex w16sdtdh w16sdtfl w16du wp14">
+<w:numbering xmlns:wpc="http://schemas.microsoft.com/office/word/2010/wordprocessingCanvas" xmlns:cx="http://schemas.microsoft.com/office/drawing/2014/chartex" xmlns:cx1="http://schemas.microsoft.com/office/drawing/2015/9/8/chartex" xmlns:cx2="http://schemas.microsoft.com/office/drawing/2015/10/21/chartex" xmlns:cx3="http://schemas.microsoft.com/office/drawing/2016/5/9/chartex" xmlns:cx4="http://schemas.microsoft.com/office/drawing/2016/5/10/chartex" xmlns:cx5="http://schemas.microsoft.com/office/drawing/2016/5/11/chartex" xmlns:cx6="http://schemas.microsoft.com/office/drawing/2016/5/12/chartex" xmlns:cx7="http://schemas.microsoft.com/office/drawing/2016/5/13/chartex" xmlns:cx8="http://schemas.microsoft.com/office/drawing/2016/5/14/chartex" xmlns:mc="http://schemas.openxmlformats.org/markup-compatibility/2006" xmlns:m="http://schemas.openxmlformats.org/officeDocument/2006/math" xmlns:aink="http://schemas.microsoft.com/office/drawing/2016/ink" xmlns:am3d="http://schemas.microsoft.com/office/drawing/2017/model3d" xmlns:oel="http://schemas.microsoft.com/office/2019/extlst" xmlns:r="http://schemas.openxmlformats.org/officeDocument/2006/relationships" xmlns:wp14="http://schemas.microsoft.com/office/word/2010/wordprocessingDrawing" xmlns:wp="http://schemas.openxmlformats.org/drawingml/2006/wordprocessingDrawing" xmlns:wpg="http://schemas.microsoft.com/office/word/2010/wordprocessingGroup" xmlns:wpi="http://schemas.microsoft.com/office/word/2010/wordprocessingInk" xmlns:wps="http://schemas.microsoft.com/office/word/2010/wordprocessingShape" xmlns:o="urn:schemas-microsoft-com:office:office" xmlns:v="urn:schemas-microsoft-com:vml" xmlns:w10="urn:schemas-microsoft-com:office:word" xmlns:w="http://schemas.openxmlformats.org/wordprocessingml/2006/main" xmlns:w14="http://schemas.microsoft.com/office/word/2010/wordml" xmlns:w15="http://schemas.microsoft.com/office/word/2012/wordml" xmlns:w16cex="http://schemas.microsoft.com/office/word/2018/wordml/cex" xmlns:w16cid="http://schemas.microsoft.com/office/word/2016/wordml/cid" xmlns:w16="http://schemas.microsoft.com/office/word/2018/wordml" xmlns:w16sdtdh="http://schemas.microsoft.com/office/word/2020/wordml/sdtdatahash" xmlns:w16sdtfl="http://schemas.microsoft.com/office/word/2024/wordml/sdtformatlock" xmlns:w16se="http://schemas.microsoft.com/office/word/2015/wordml/symex" xmlns:w16du="http://schemas.microsoft.com/office/word/2023/wordml/word16du" xmlns:wne="http://schemas.microsoft.com/office/word/2006/wordml" mc:Ignorable="w14 w15 w16se w16cid w16 w16cex w16sdtdh w16sdtfl w16du wp14">
   <w:abstractNum w:abstractNumId="0" w15:restartNumberingAfterBreak="0">
     <w:nsid w:val="0000A991"/>
     <w:multiLevelType w:val="multilevel"/>
@@ -30099,7 +30113,7 @@
 </file>
 
 <file path=word/styles.xml><?xml version="1.0" encoding="utf-8"?>
-<w:styles xmlns:mc="http://schemas.openxmlformats.org/markup-compatibility/2006" xmlns:r="http://schemas.openxmlformats.org/officeDocument/2006/relationships" xmlns:w="http://schemas.openxmlformats.org/wordprocessingml/2006/main" xmlns:w14="http://schemas.microsoft.com/office/word/2010/wordml" xmlns:w15="http://schemas.microsoft.com/office/word/2012/wordml" xmlns:w16cex="http://schemas.microsoft.com/office/word/2018/wordml/cex" xmlns:w16cid="http://schemas.microsoft.com/office/word/2016/wordml/cid" xmlns:w16="http://schemas.microsoft.com/office/word/2018/wordml" xmlns:w16du="http://schemas.microsoft.com/office/word/2023/wordml/word16du" xmlns:w16sdtdh="http://schemas.microsoft.com/office/word/2020/wordml/sdtdatahash" xmlns:w16sdtfl="http://schemas.microsoft.com/office/word/2024/wordml/sdtformatlock" xmlns:w16se="http://schemas.microsoft.com/office/word/2015/wordml/symex" mc:Ignorable="w14 w15 w16se w16cid w16 w16cex w16sdtdh w16sdtfl w16du">
+<w:styles xmlns:mc="http://schemas.openxmlformats.org/markup-compatibility/2006" xmlns:r="http://schemas.openxmlformats.org/officeDocument/2006/relationships" xmlns:w="http://schemas.openxmlformats.org/wordprocessingml/2006/main" xmlns:w14="http://schemas.microsoft.com/office/word/2010/wordml" xmlns:w15="http://schemas.microsoft.com/office/word/2012/wordml" xmlns:w16cex="http://schemas.microsoft.com/office/word/2018/wordml/cex" xmlns:w16cid="http://schemas.microsoft.com/office/word/2016/wordml/cid" xmlns:w16="http://schemas.microsoft.com/office/word/2018/wordml" xmlns:w16sdtdh="http://schemas.microsoft.com/office/word/2020/wordml/sdtdatahash" xmlns:w16sdtfl="http://schemas.microsoft.com/office/word/2024/wordml/sdtformatlock" xmlns:w16se="http://schemas.microsoft.com/office/word/2015/wordml/symex" xmlns:w16du="http://schemas.microsoft.com/office/word/2023/wordml/word16du" mc:Ignorable="w14 w15 w16se w16cid w16 w16cex w16sdtdh w16sdtfl w16du">
   <w:docDefaults>
     <w:rPrDefault>
       <w:rPr>

</xml_diff>